<commit_message>
Add revised manuscript, highlighted PDF, response to reviewers and cover letter; final analysis numbers
</commit_message>
<xml_diff>
--- a/manuscript/response_to_reviewers.docx
+++ b/manuscript/response_to_reviewers.docx
@@ -897,7 +897,7 @@
           <w:rFonts w:ascii="Calibri" w:hAnsi="Calibri"/>
           <w:sz w:val="22"/>
         </w:rPr>
-        <w:t>We updated the manuscript. Table 6 (all variants), Tables E1 and E2 in Appendix E (per cell and per round, including rubric totals), and Table 10 (judge totals). The full per-round records, including candidate texts, are in the repository under results/revision.</w:t>
+        <w:t>We updated the manuscript. Table 6 (all variants), Tables 15 and 16 in Appendix E (per cell and per round, including rubric totals), and Table 10 (judge totals). The full per-round records, including candidate texts, are in the repository under results/revision.</w:t>
       </w:r>
     </w:p>
     <w:p/>
@@ -1036,24 +1036,24 @@
           <w:rFonts w:ascii="Calibri" w:hAnsi="Calibri"/>
           <w:sz w:val="22"/>
         </w:rPr>
-        <w:t>We could not rerun the GPT-4o/GPT-3.5-turbo configuration (no API access for that setup), so the claim that the layer 'depends on the refiner's capability' is no longer stated as a finding. We instead varied the refiner with the target fixed at Qwen3-1.7B: Qwen3-235B-A22B and GPT-6 Luna (through a router API). With Qwen3-235B the layer produced significant gains in 4 of 9 cells (mean +8.7 points); with GPT-6 Luna in 1 cell (mean +3.0 points). The gains occur where the base prompt fails on answer format, and the accepted candidates add a format instruction and example, so they do not isolate the rubric. Local 4B/8B refiners were not run because the shared GPU was too slow for the extra servers. The original per-task GPT-3.5 results, with the validation leak flagged, and the Gemini check are in Appendix D.</w:t>
-      </w:r>
-    </w:p>
-    <w:p>
-      <w:r>
-        <w:rPr>
-          <w:rFonts w:ascii="Calibri" w:hAnsi="Calibri"/>
-          <w:b/>
-          <w:sz w:val="22"/>
-        </w:rPr>
-        <w:t xml:space="preserve">Author action: </w:t>
-      </w:r>
-      <w:r>
-        <w:rPr>
-          <w:rFonts w:ascii="Calibri" w:hAnsi="Calibri"/>
-          <w:sz w:val="22"/>
-        </w:rPr>
-        <w:t>We updated the manuscript. Sections 5.6 and 6.1 and Table 9; Appendix D (Table D1); the abstract and conclusion state the limited scope.</w:t>
+        <w:t>We could not rerun the GPT-4o/GPT-3.5-turbo configuration (no API access for that setup), so the claim that the layer 'depends on the refiner's capability' is no longer stated as a finding. We instead varied the refiner with the target fixed at Qwen3-1.7B: Qwen3-235B-A22B and GPT-6 Luna (through a router API). With Qwen3-235B the layer produced significant gains in 4 of 9 cells (mean +8.7 points); with GPT-6 Luna in 1 cell (mean +3.0 points). The gains occur where the base prompt fails on answer format, and the accepted candidates add a format instruction and example, so they do not isolate the rubric. Exploratory follow-up: the rubric-free gated rewrite with the same refiner gives +6.0 points (2 winning cells of 9); a second MPIR seed gives +12.3 points (4 winning cells) (Section 5.6.1). Local 4B/8B refiners were not run because the shared GPU was too slow for the extra servers. The original per-task GPT-3.5 results, with the validation leak flagged, and the Gemini check are in Appendix D.</w:t>
+      </w:r>
+    </w:p>
+    <w:p>
+      <w:r>
+        <w:rPr>
+          <w:rFonts w:ascii="Calibri" w:hAnsi="Calibri"/>
+          <w:b/>
+          <w:sz w:val="22"/>
+        </w:rPr>
+        <w:t xml:space="preserve">Author action: </w:t>
+      </w:r>
+      <w:r>
+        <w:rPr>
+          <w:rFonts w:ascii="Calibri" w:hAnsi="Calibri"/>
+          <w:sz w:val="22"/>
+        </w:rPr>
+        <w:t>We updated the manuscript. Sections 5.6 and 6.1 and Table 9; Appendix D (Table 14); the abstract and conclusion state the limited scope.</w:t>
       </w:r>
     </w:p>
     <w:p/>
@@ -1105,7 +1105,7 @@
           <w:rFonts w:ascii="Calibri" w:hAnsi="Calibri"/>
           <w:sz w:val="22"/>
         </w:rPr>
-        <w:t>We updated the manuscript. Section 5.1, Tables 4 and 5, Appendix C (Tables C1 and C2).</w:t>
+        <w:t>We updated the manuscript. Section 5.1, Tables 4 and 5, Appendix C (Tables 12 and 13).</w:t>
       </w:r>
     </w:p>
     <w:p/>
@@ -1764,7 +1764,7 @@
           <w:rFonts w:ascii="Calibri" w:hAnsi="Calibri"/>
           <w:sz w:val="22"/>
         </w:rPr>
-        <w:t>The seeded partition procedure, the use of original example indices and the shared partition across optimizers are described; the serving configuration is in Table C2.</w:t>
+        <w:t>The seeded partition procedure, the use of original example indices and the shared partition across optimizers are described; the serving configuration is in Table 13.</w:t>
       </w:r>
     </w:p>
     <w:p>
@@ -3012,7 +3012,7 @@
           <w:rFonts w:ascii="Calibri" w:hAnsi="Calibri"/>
           <w:sz w:val="22"/>
         </w:rPr>
-        <w:t>Reported in Tables E1 and E2 and Table 6, separating degraded candidates, ties and guard-intercepted outputs; full logs are in the repository.</w:t>
+        <w:t>Reported in Tables 15 and 16 and Table 6, separating degraded candidates, ties and guard-intercepted outputs; full logs are in the repository.</w:t>
       </w:r>
     </w:p>
     <w:p>
@@ -3064,7 +3064,7 @@
           <w:rFonts w:ascii="Calibri" w:hAnsi="Calibri"/>
           <w:sz w:val="22"/>
         </w:rPr>
-        <w:t>We varied the refiner with the target fixed (Section 5.6). The question is only partly answered: a much larger refiner helps in some cells, GPT-6 Luna in fewer, and the gains coincide with a repaired answer format. The original GPT-4o/GPT-3.5 setting was not rerun.</w:t>
+        <w:t>We varied the refiner with the target fixed (Section 5.6). The question is only partly answered: a much larger refiner helps in some cells, GPT-6 Luna in fewer, and the gains coincide with a repaired answer format. Exploratory follow-up: the rubric-free gated rewrite with the same refiner gives +6.0 points (2 winning cells of 9); a second MPIR seed gives +12.3 points (4 winning cells) (Section 5.6.1). The original GPT-4o/GPT-3.5 setting was not rerun.</w:t>
       </w:r>
     </w:p>
     <w:p>

</xml_diff>

<commit_message>
Apply final fact-check corrections: lenient results for both seeds, distinct-candidate column, protected variants in Table 9, response letter alignment
</commit_message>
<xml_diff>
--- a/manuscript/response_to_reviewers.docx
+++ b/manuscript/response_to_reviewers.docx
@@ -793,7 +793,7 @@
           <w:rFonts w:ascii="Calibri" w:hAnsi="Calibri"/>
           <w:sz w:val="22"/>
         </w:rPr>
-        <w:t>The revised manuscript is a new study. We repaired the refinement loop, added a time-stamped protocol, and ran 45 base prompts with three optimizers, nine tasks and up to three seeds, plus a mechanism study, a refiner-capability study, a judge-validity analysis, a serving-noise measurement and a format-exemplar intervention. We reframed the paper as a negative-result report. Two things we could not do: rerun the GPT-4o/GPT-3.5-turbo configuration, and collect human ratings of the rubric. We say so in the manuscript. The new title is 'Does Rubric-Guided Refinement Improve Automatically Optimized Prompts? A Pre-Specified Negative-Result Study with Small Open-Weight Models'. Section numbers below refer to the revised manuscript; code, per-round logs and generations are public.</w:t>
+        <w:t>The revised manuscript is a new study. We repaired the refinement loop, added a time-stamped protocol, and ran 45 base prompts with three optimizers, nine tasks and up to three seeds, plus a mechanism study, a refiner-capability study, format-protected variants, a judge-validity analysis, a serving-noise measurement and a format-exemplar intervention. We reframed the paper as a negative-result report. Two things we could not do: rerun the GPT-4o/GPT-3.5-turbo configuration, and collect human ratings of the rubric. We say so in the manuscript. The new title is 'Does Rubric-Guided Refinement Improve Automatically Optimized Prompts? A Pre-Specified Negative-Result Study'. Section numbers below refer to the revised manuscript; code, per-round logs and generations are public.</w:t>
       </w:r>
     </w:p>
     <w:p/>
@@ -984,7 +984,7 @@
           <w:rFonts w:ascii="Calibri" w:hAnsi="Calibri"/>
           <w:sz w:val="22"/>
         </w:rPr>
-        <w:t>(a) We now state that the pilot tasks were chosen on a biased statistic, rank them in the original (leaked) results (Appendix D), and add six tasks drawn uniformly at random with a stated generator and seed (random.Random(20261019)). (b) 'Pre-registered' is withdrawn. The pilot's go/no-go rule was written in a version-controlled planning document (commit 7612aa0, 2026-09-03) before the pilot ran; several pipeline fixes were made while it ran, and these are listed. For this revision, REVISION_PROTOCOL.md (commit 8fd1397, 2026-10-19) fixed the decision rules before any revised experiment; its dated amendments, including one exploratory follow-up added after the results were seen, are listed. Neither is a registry entry and the paper says so. (c) Tier 1 now uses three seeds (42-44), and the main grid uses up to three MPIR seeds. We did not run all BBH tasks: nine of 27 task files were used.</w:t>
+        <w:t>(a) We now state that the pilot tasks were chosen on a biased statistic, rank them in the original (leaked) results (Appendix D), and add six tasks drawn uniformly at random with a stated generator and seed (random.Random(20261019)). (b) 'Pre-registered' is withdrawn. The pilot's go/no-go rule was written in a version-controlled planning document (commit 7612aa0, 2026-09-03) before the pilot ran; several pipeline fixes were made while it ran, and these are listed. For this revision, REVISION_PROTOCOL.md (commit 8fd1397, 2026-10-19) fixed the decision rules before any revised experiment; its dated amendments, including two exploratory additions made after results were seen, are listed. Neither is a registry entry and the paper says so. (c) Tier 1 now uses three seeds (42-44), and the main grid uses up to three MPIR seeds. We did not run all BBH tasks: nine of 27 task files were used.</w:t>
       </w:r>
     </w:p>
     <w:p>
@@ -1036,7 +1036,7 @@
           <w:rFonts w:ascii="Calibri" w:hAnsi="Calibri"/>
           <w:sz w:val="22"/>
         </w:rPr>
-        <w:t>We could not rerun the GPT-4o/GPT-3.5-turbo configuration (no API access for that setup), so the claim that the layer 'depends on the refiner's capability' is no longer stated as a finding. We instead varied the refiner with the target fixed at Qwen3-1.7B: Qwen3-235B-A22B and GPT-6 Luna (through a router API). With Qwen3-235B the layer produced significant gains in 4 of 9 cells (mean +8.7 points); with GPT-6 Luna in 1 cell (mean +3.0 points). The gains occur where the base prompt fails on answer format, and the accepted candidates add a format instruction and example, so they do not isolate the rubric. Exploratory follow-up: the rubric-free gated rewrite with the same refiner gives +6.0 points (2 winning cells of 9); a second MPIR seed gives +12.3 points (4 winning cells) (Section 5.6.1). Local 4B/8B refiners were not run because the shared GPU was too slow for the extra servers. The original per-task GPT-3.5 results, with the validation leak flagged, and the Gemini check are in Appendix D.</w:t>
+        <w:t>We could not rerun the GPT-4o/GPT-3.5-turbo configuration (no API access for that setup), so the claim that the layer 'depends on the refiner's capability' is no longer stated as a finding. We instead varied the refiner with the target fixed at Qwen3-1.7B: Qwen3-235B-A22B and GPT-6 Luna (through a router API). With Qwen3-235B the layer produced significant gains in 4 of 9 cells (mean +8.7 points); with GPT-6 Luna in 1 cell (mean +3.0 points). Under lenient answer extraction only one of these gains remains in the first seed (hyperbaton with PromptWizard; mean -3.2 points, 3 significant losses), and in the second seed the lenient mean is +0.9 points. The strict gains occur where the base prompt fails on answer format, and the accepted candidates add a format instruction and example, so they do not isolate the rubric. Exploratory follow-up: the rubric-free gated rewrite with the same refiner gives +6.0 points (2 winning cells of 9); a second MPIR seed gives +12.3 points (4 winning cells) (Section 5.6.1). Local 4B/8B refiners were not run because the shared GPU was too slow for the extra servers. The original per-task GPT-3.5 results, with the validation leak flagged, and the Gemini check are in Appendix D.</w:t>
       </w:r>
     </w:p>
     <w:p>
@@ -1140,7 +1140,7 @@
           <w:rFonts w:ascii="Calibri" w:hAnsi="Calibri"/>
           <w:sz w:val="22"/>
         </w:rPr>
-        <w:t>We added a gated free rewrite (V3), scored every validated candidate on the test split, and re-applied four acceptance rules offline (strict, non-strict, mean of three validation scorings, and a larger gate formed from the validation split plus half of the test split). The gate is not the bottleneck: ungated candidates are on average -27.0 and -15.2 points relative to P0 (V1, V2), no cell has a candidate that beats P0 by 3 points, and validation tracks test accuracy (Spearman 0.92). The statement that unstructured rewriting is 'at least as unreliable' as MPIR was removed. The repeated-scoring distribution of P0 is in Section 5.7.</w:t>
+        <w:t>We added a gated free rewrite (V3), scored every validated candidate on the test split, and re-applied four acceptance rules offline (strict, non-strict, mean of three validation scorings, and a larger gate formed from the validation split plus half of the test split). The gate is not the bottleneck: ungated candidates are on average -27.0 and -15.2 points relative to P0 (V1, V2), no cell has a candidate that beats P0 by 3 points, and validation tracks test accuracy across candidates (Spearman 0.92), although this is driven by candidates that score zero and is 0.37 among plausible 1.7B candidates (n = 27). The statement that unstructured rewriting is 'at least as unreliable' as MPIR was removed. The repeated-scoring distribution of P0 is in Section 5.7.</w:t>
       </w:r>
     </w:p>
     <w:p>
@@ -1972,7 +1972,7 @@
           <w:rFonts w:ascii="Calibri" w:hAnsi="Calibri"/>
           <w:sz w:val="22"/>
         </w:rPr>
-        <w:t>The text now notes that the hyperbaton difference is 6 items and within noise.</w:t>
+        <w:t>The text now notes that the hyperbaton difference is 4 test items and within noise.</w:t>
       </w:r>
     </w:p>
     <w:p>
@@ -2648,7 +2648,7 @@
           <w:rFonts w:ascii="Calibri" w:hAnsi="Calibri"/>
           <w:sz w:val="22"/>
         </w:rPr>
-        <w:t>Lenient accuracy is reported for every base prompt; the conclusions about MPIR do not change, but the apparent weakness of exemplar-free baselines is largely a format effect.</w:t>
+        <w:t>Lenient accuracy is reported for every base prompt and for the final prompts of the strong refiners. The apparent weakness of exemplar-free baselines is largely a format effect, and it changes the reading of the strong-refiner gains: under lenient extraction only one of them remains in the first seed (Section 5.6). The exemplar intervention gains +42.3 points for ProTeGi under strict and +10.2 under lenient extraction.</w:t>
       </w:r>
     </w:p>
     <w:p>
@@ -2700,7 +2700,7 @@
           <w:rFonts w:ascii="Calibri" w:hAnsi="Calibri"/>
           <w:sz w:val="22"/>
         </w:rPr>
-        <w:t>Done with Qwen3-235B-A22B and GPT-6 Luna (Section 5.6): wins in 4 and 1 of 9 cells.</w:t>
+        <w:t>Done with Qwen3-235B-A22B and GPT-6 Luna (Section 5.6): strict wins in 4 and 1 of 9 cells; under lenient extraction the first-seed Qwen3-235B result is 1 win and 3 significant losses, and the format-protected variants of the 1.7B refiner remain worse than P0.</w:t>
       </w:r>
     </w:p>
     <w:p>
@@ -3064,7 +3064,7 @@
           <w:rFonts w:ascii="Calibri" w:hAnsi="Calibri"/>
           <w:sz w:val="22"/>
         </w:rPr>
-        <w:t>We varied the refiner with the target fixed (Section 5.6). The question is only partly answered: a much larger refiner helps in some cells, GPT-6 Luna in fewer, and the gains coincide with a repaired answer format. Exploratory follow-up: the rubric-free gated rewrite with the same refiner gives +6.0 points (2 winning cells of 9); a second MPIR seed gives +12.3 points (4 winning cells) (Section 5.6.1). The original GPT-4o/GPT-3.5 setting was not rerun.</w:t>
+        <w:t>We varied the refiner with the target fixed (Section 5.6). The question is only partly answered: a much larger refiner gains under strict scoring in some cells, GPT-6 Luna in fewer, and most of the strict gains do not hold under lenient scoring. Exploratory follow-up: the rubric-free gated rewrite with the same refiner gives +6.0 points (2 winning cells of 9); a second MPIR seed gives +12.3 points (4 winning cells) (Section 5.6.1). The original GPT-4o/GPT-3.5 setting was not rerun.</w:t>
       </w:r>
     </w:p>
     <w:p>

</xml_diff>